<commit_message>
NP 055 e Anexo I atualizados; FR 049_B Rev.03
- NP: teste de compressão a cada 1.000 h e análise de óleo em rodízio
  (definições, 4.3, 4.5, 5.2, 9); horímetro do motor de popa e das
  motobombas no FR 027_L (4.4); lote e validade do lubrificante no
  FR 049_B e na OM, proibido óleo vencido (5.9); tabela 8 e histórico
- Anexo I: bomba de água bruta (1.1.9), compressão junto com os bicos
  (1.1.12), overhaul pela compressão (1.1.28), rodízio de óleo (1.1.29)
- FR 049_B Rev.03: coluna Validade (mm/aa), obrigatória na troca e
  bloqueia lubrificante vencido

Co-Authored-By: Claude Opus 5.5 <noreply@anthropic.com>
Claude-Session: https://claude.ai/code/session_01PZoM9S2oW9Ku6UFB6yywhw
</commit_message>
<xml_diff>
--- a/docs/NP_Navecunha_055_corrigida.docx
+++ b/docs/NP_Navecunha_055_corrigida.docx
@@ -664,7 +664,7 @@
         <w:rPr>
           <w:rFonts w:eastAsia="Arial" w:cs="Arial" w:ascii="Arial" w:hAnsi="Arial"/>
         </w:rPr>
-        <w:t xml:space="preserve"> monitoramento da condição dos equipamentos para antecipar falhas e definir o momento da intervenção. Na Navegação Cunha, compreende a análise de óleo semestral e a análise trimestral da tendência de parâmetros dos MCPs (Anexo I).</w:t>
+        <w:t xml:space="preserve"> monitoramento da condição dos equipamentos para antecipar falhas e definir o momento da intervenção. Na Navegação Cunha, compreende o teste de compressão dos MCPs a cada 1.000 h, feito junto com a calibração dos bicos injetores; a análise de óleo semestral em regime de rodízio, priorizada pelo resultado desse teste; e a análise trimestral da tendência de parâmetros dos MCPs (Anexo I).</w:t>
       </w:r>
     </w:p>
     <w:p>
@@ -1687,13 +1687,7 @@
         <w:rPr>
           <w:rFonts w:eastAsia="Arial" w:cs="Arial" w:ascii="Arial" w:hAnsi="Arial"/>
         </w:rPr>
-        <w:t xml:space="preserve">• </w:t>
-      </w:r>
-      <w:r>
-        <w:rPr>
-          <w:rFonts w:eastAsia="Arial" w:cs="Arial" w:ascii="Arial" w:hAnsi="Arial"/>
-        </w:rPr>
-        <w:t>Avaliar e autorizar a Solicitação e a Ordem de Compra no sistema SANKHYA para aquisição de materiais e serviços de manutenção preventiva, preditiva e corretiva.</w:t>
+        <w:t xml:space="preserve">• Avaliar e autorizar a Solicitação e a Ordem de Compra no sistema SANKHYA para aquisição de materiais e serviços de manutenção preventiva, preditiva e corretiva.</w:t>
       </w:r>
     </w:p>
     <w:p>
@@ -2216,7 +2210,7 @@
         <w:rPr>
           <w:rFonts w:eastAsia="Arial" w:cs="Arial" w:ascii="Arial" w:hAnsi="Arial"/>
         </w:rPr>
-        <w:t xml:space="preserve"> analisar os laudos de óleo e a tendência trimestral de parâmetros e abrir OM quando houver alerta. A compilação dos dados pode ser feita pelo Analista de Manutenção, quando houver.</w:t>
+        <w:t xml:space="preserve"> acompanhar o teste de compressão dos MCPs (a cada 1.000 h), os laudos de óleo e a tendência trimestral de parâmetros e abrir OM quando houver alerta. Definir, a cada semestre, o MCP da amostra de óleo (rodízio – Anexo I, item 1.1.29), priorizando a menor compressão, a maior queda entre medições ou o maior consumo de óleo, e garantir que cada MCP seja analisado ao menos 1 (uma) vez a cada 24 meses. A compilação dos dados pode ser feita pelo Analista de Manutenção, quando houver.</w:t>
       </w:r>
     </w:p>
     <w:p>
@@ -2625,7 +2619,7 @@
           <w:rFonts w:cs="Arial" w:ascii="Arial" w:hAnsi="Arial"/>
           <w:lang w:eastAsia="pt-BR"/>
         </w:rPr>
-        <w:t xml:space="preserve"> registrar no FR 027_L, na chegada e na saída, os horímetros dos MCPs e MCAs.</w:t>
+        <w:t xml:space="preserve"> registrar no FR 027_L, na chegada e na saída, os horímetros dos MCPs, dos MCAs, do motor de popa e das motobombas (5 HP e de incêndio).</w:t>
       </w:r>
     </w:p>
     <w:p>
@@ -3054,7 +3048,7 @@
         <w:rPr>
           <w:rFonts w:cs="Arial" w:ascii="Arial" w:hAnsi="Arial"/>
         </w:rPr>
-        <w:t xml:space="preserve"> coletar e identificar a amostra de óleo do MCP na troca programada para análise (Anexo I).</w:t>
+        <w:t xml:space="preserve"> coletar e identificar a amostra de óleo do MCP indicado pelo Supervisor de Manutenção (rodízio – Anexo I, item 1.1.29), na troca programada, e sempre que for solicitada coleta extra por suspeita.</w:t>
       </w:r>
     </w:p>
     <w:p>
@@ -5235,15 +5229,7 @@
           <w:sz w:val="20"/>
           <w:szCs w:val="20"/>
         </w:rPr>
-        <w:t>• </w:t>
-      </w:r>
-      <w:r>
-        <w:rPr>
-          <w:rFonts w:cs="Arial" w:ascii="Arial" w:hAnsi="Arial"/>
-          <w:sz w:val="20"/>
-          <w:szCs w:val="20"/>
-        </w:rPr>
-        <w:t>estruturada em três pilares;</w:t>
+        <w:t>• estruturada em três pilares;</w:t>
       </w:r>
     </w:p>
     <w:p>
@@ -5564,7 +5550,7 @@
               <w:rPr>
                 <w:rFonts w:eastAsia="Arial" w:cs="Arial" w:ascii="Arial" w:hAnsi="Arial"/>
               </w:rPr>
-              <w:t>Análise de óleo semestral do MCP e tendência trimestral de parâmetros</w:t>
+              <w:t>Teste de compressão a cada 1.000 h, análise de óleo semestral em rodízio e tendência trimestral de parâmetros</w:t>
             </w:r>
           </w:p>
           <w:p>
@@ -5980,13 +5966,7 @@
         <w:rPr>
           <w:rFonts w:eastAsia="Arial" w:cs="Arial" w:ascii="Arial" w:hAnsi="Arial"/>
         </w:rPr>
-        <w:t xml:space="preserve">• </w:t>
-      </w:r>
-      <w:r>
-        <w:rPr>
-          <w:rFonts w:eastAsia="Arial" w:cs="Arial" w:ascii="Arial" w:hAnsi="Arial"/>
-        </w:rPr>
-        <w:t>Drenar o filtro separador de diesel dos MCPs e MCAs;</w:t>
+        <w:t xml:space="preserve">• Drenar o filtro separador de diesel dos MCPs e MCAs;</w:t>
       </w:r>
     </w:p>
     <w:p>
@@ -6002,13 +5982,7 @@
         <w:rPr>
           <w:rFonts w:eastAsia="Arial" w:cs="Arial" w:ascii="Arial" w:hAnsi="Arial"/>
         </w:rPr>
-        <w:t xml:space="preserve">• </w:t>
-      </w:r>
-      <w:r>
-        <w:rPr>
-          <w:rFonts w:eastAsia="Arial" w:cs="Arial" w:ascii="Arial" w:hAnsi="Arial"/>
-        </w:rPr>
-        <w:t>Drenar o tanque de serviço;</w:t>
+        <w:t xml:space="preserve">• Drenar o tanque de serviço;</w:t>
       </w:r>
     </w:p>
     <w:p>
@@ -6024,13 +5998,7 @@
         <w:rPr>
           <w:rFonts w:eastAsia="Arial" w:cs="Arial" w:ascii="Arial" w:hAnsi="Arial"/>
         </w:rPr>
-        <w:t xml:space="preserve">• </w:t>
-      </w:r>
-      <w:r>
-        <w:rPr>
-          <w:rFonts w:eastAsia="Arial" w:cs="Arial" w:ascii="Arial" w:hAnsi="Arial"/>
-        </w:rPr>
-        <w:t>Verificar o nível de óleo lubrificante dos MCPs, MCAs e reversores;</w:t>
+        <w:t xml:space="preserve">• Verificar o nível de óleo lubrificante dos MCPs, MCAs e reversores;</w:t>
       </w:r>
     </w:p>
     <w:p>
@@ -6046,13 +6014,7 @@
         <w:rPr>
           <w:rFonts w:eastAsia="Arial" w:cs="Arial" w:ascii="Arial" w:hAnsi="Arial"/>
         </w:rPr>
-        <w:t xml:space="preserve">• </w:t>
-      </w:r>
-      <w:r>
-        <w:rPr>
-          <w:rFonts w:eastAsia="Arial" w:cs="Arial" w:ascii="Arial" w:hAnsi="Arial"/>
-        </w:rPr>
-        <w:t>Verificar o nível do líquido de arrefecimento dos MCPs e MCAs;</w:t>
+        <w:t xml:space="preserve">• Verificar o nível do líquido de arrefecimento dos MCPs e MCAs;</w:t>
       </w:r>
     </w:p>
     <w:p>
@@ -6068,13 +6030,7 @@
         <w:rPr>
           <w:rFonts w:eastAsia="Arial" w:cs="Arial" w:ascii="Arial" w:hAnsi="Arial"/>
         </w:rPr>
-        <w:t xml:space="preserve">• </w:t>
-      </w:r>
-      <w:r>
-        <w:rPr>
-          <w:rFonts w:eastAsia="Arial" w:cs="Arial" w:ascii="Arial" w:hAnsi="Arial"/>
-        </w:rPr>
-        <w:t>Verificar o ajuste das correias dos motores;</w:t>
+        <w:t xml:space="preserve">• Verificar o ajuste das correias dos motores;</w:t>
       </w:r>
     </w:p>
     <w:p>
@@ -6088,13 +6044,7 @@
         <w:rPr>
           <w:rFonts w:eastAsia="Arial" w:cs="Arial" w:ascii="Arial" w:hAnsi="Arial"/>
         </w:rPr>
-        <w:t xml:space="preserve">• </w:t>
-      </w:r>
-      <w:r>
-        <w:rPr>
-          <w:rFonts w:eastAsia="Arial" w:cs="Arial" w:ascii="Arial" w:hAnsi="Arial"/>
-        </w:rPr>
-        <w:t>Verificar a integridade da caixa de bateria, da manta de isolamento contra curto-circuito e da fixação dos cabos e bornes, que devem estar limpos, apertados e protegidos com vaselina;</w:t>
+        <w:t xml:space="preserve">• Verificar a integridade da caixa de bateria, da manta de isolamento contra curto-circuito e da fixação dos cabos e bornes, que devem estar limpos, apertados e protegidos com vaselina;</w:t>
       </w:r>
     </w:p>
     <w:p>
@@ -6110,13 +6060,7 @@
         <w:rPr>
           <w:rFonts w:eastAsia="Arial" w:cs="Arial" w:ascii="Arial" w:hAnsi="Arial"/>
         </w:rPr>
-        <w:t xml:space="preserve">• </w:t>
-      </w:r>
-      <w:r>
-        <w:rPr>
-          <w:rFonts w:eastAsia="Arial" w:cs="Arial" w:ascii="Arial" w:hAnsi="Arial"/>
-        </w:rPr>
-        <w:t>Abrir a válvula do sistema de resfriamento do bucim;</w:t>
+        <w:t xml:space="preserve">• Abrir a válvula do sistema de resfriamento do bucim;</w:t>
       </w:r>
     </w:p>
     <w:p>
@@ -6132,13 +6076,7 @@
         <w:rPr>
           <w:rFonts w:eastAsia="Arial" w:cs="Arial" w:ascii="Arial" w:hAnsi="Arial"/>
         </w:rPr>
-        <w:t xml:space="preserve">• </w:t>
-      </w:r>
-      <w:r>
-        <w:rPr>
-          <w:rFonts w:eastAsia="Arial" w:cs="Arial" w:ascii="Arial" w:hAnsi="Arial"/>
-        </w:rPr>
-        <w:t>Testar o alarme de nível do porão;</w:t>
+        <w:t xml:space="preserve">• Testar o alarme de nível do porão;</w:t>
       </w:r>
     </w:p>
     <w:p>
@@ -6154,13 +6092,7 @@
         <w:rPr>
           <w:rFonts w:eastAsia="Arial" w:cs="Arial" w:ascii="Arial" w:hAnsi="Arial"/>
         </w:rPr>
-        <w:t xml:space="preserve">• </w:t>
-      </w:r>
-      <w:r>
-        <w:rPr>
-          <w:rFonts w:eastAsia="Arial" w:cs="Arial" w:ascii="Arial" w:hAnsi="Arial"/>
-        </w:rPr>
-        <w:t>Testar a parada de emergência com o motor em marcha lenta, confirmando o desligamento imediato.</w:t>
+        <w:t xml:space="preserve">• Testar a parada de emergência com o motor em marcha lenta, confirmando o desligamento imediato.</w:t>
       </w:r>
     </w:p>
     <w:p>
@@ -6305,13 +6237,7 @@
         <w:rPr>
           <w:rFonts w:eastAsia="Arial" w:cs="Arial" w:ascii="Arial" w:hAnsi="Arial"/>
         </w:rPr>
-        <w:t xml:space="preserve">• </w:t>
-      </w:r>
-      <w:r>
-        <w:rPr>
-          <w:rFonts w:eastAsia="Arial" w:cs="Arial" w:ascii="Arial" w:hAnsi="Arial"/>
-        </w:rPr>
-        <w:t>Monitorar os instrumentos dos MCPs e MCAs (pressão de óleo, temperatura do óleo e da água, tensão da bateria e ruídos anormais);</w:t>
+        <w:t xml:space="preserve">• Monitorar os instrumentos dos MCPs e MCAs (pressão de óleo, temperatura do óleo e da água, tensão da bateria e ruídos anormais);</w:t>
       </w:r>
     </w:p>
     <w:p>
@@ -6327,13 +6253,7 @@
         <w:rPr>
           <w:rFonts w:eastAsia="Arial" w:cs="Arial" w:ascii="Arial" w:hAnsi="Arial"/>
         </w:rPr>
-        <w:t xml:space="preserve">• </w:t>
-      </w:r>
-      <w:r>
-        <w:rPr>
-          <w:rFonts w:eastAsia="Arial" w:cs="Arial" w:ascii="Arial" w:hAnsi="Arial"/>
-        </w:rPr>
-        <w:t>Inspecionar vazamentos nos motores e no sistema hidráulico de governo (bomba, tubulação, mangueiras, conexões e vedações);</w:t>
+        <w:t xml:space="preserve">• Inspecionar vazamentos nos motores e no sistema hidráulico de governo (bomba, tubulação, mangueiras, conexões e vedações);</w:t>
       </w:r>
     </w:p>
     <w:p>
@@ -6349,13 +6269,7 @@
         <w:rPr>
           <w:rFonts w:eastAsia="Arial" w:cs="Arial" w:ascii="Arial" w:hAnsi="Arial"/>
         </w:rPr>
-        <w:t xml:space="preserve">• </w:t>
-      </w:r>
-      <w:r>
-        <w:rPr>
-          <w:rFonts w:eastAsia="Arial" w:cs="Arial" w:ascii="Arial" w:hAnsi="Arial"/>
-        </w:rPr>
-        <w:t>Verificar o gotejamento do bucim;</w:t>
+        <w:t xml:space="preserve">• Verificar o gotejamento do bucim;</w:t>
       </w:r>
     </w:p>
     <w:p>
@@ -6371,13 +6285,7 @@
         <w:rPr>
           <w:rFonts w:eastAsia="Arial" w:cs="Arial" w:ascii="Arial" w:hAnsi="Arial"/>
         </w:rPr>
-        <w:t xml:space="preserve">• </w:t>
-      </w:r>
-      <w:r>
-        <w:rPr>
-          <w:rFonts w:eastAsia="Arial" w:cs="Arial" w:ascii="Arial" w:hAnsi="Arial"/>
-        </w:rPr>
-        <w:t>Inspecionar visualmente o porão e testar o alarme de nível;</w:t>
+        <w:t xml:space="preserve">• Inspecionar visualmente o porão e testar o alarme de nível;</w:t>
       </w:r>
     </w:p>
     <w:p>
@@ -6391,13 +6299,7 @@
         <w:rPr>
           <w:rFonts w:eastAsia="Arial" w:cs="Arial" w:ascii="Arial" w:hAnsi="Arial"/>
         </w:rPr>
-        <w:t xml:space="preserve">• </w:t>
-      </w:r>
-      <w:r>
-        <w:rPr>
-          <w:rFonts w:eastAsia="Arial" w:cs="Arial" w:ascii="Arial" w:hAnsi="Arial"/>
-        </w:rPr>
-        <w:t>No MCA fora de operação: drenar o filtro separador e verificar os níveis de óleo e de arrefecimento antes de colocá-lo em uso;</w:t>
+        <w:t xml:space="preserve">• No MCA fora de operação: drenar o filtro separador e verificar os níveis de óleo e de arrefecimento antes de colocá-lo em uso;</w:t>
       </w:r>
     </w:p>
     <w:p>
@@ -6413,13 +6315,7 @@
         <w:rPr>
           <w:rFonts w:eastAsia="Arial" w:cs="Arial" w:ascii="Arial" w:hAnsi="Arial"/>
         </w:rPr>
-        <w:t xml:space="preserve">• </w:t>
-      </w:r>
-      <w:r>
-        <w:rPr>
-          <w:rFonts w:eastAsia="Arial" w:cs="Arial" w:ascii="Arial" w:hAnsi="Arial"/>
-        </w:rPr>
-        <w:t>Nos MCPs: drenar o filtro separador e verificar os níveis de óleo e de arrefecimento ao menos uma vez ao dia, aproveitando as paradas operacionais.</w:t>
+        <w:t xml:space="preserve">• Nos MCPs: drenar o filtro separador e verificar os níveis de óleo e de arrefecimento ao menos uma vez ao dia, aproveitando as paradas operacionais.</w:t>
       </w:r>
     </w:p>
     <w:p>
@@ -8867,7 +8763,7 @@
           <w:sz w:val="20"/>
           <w:szCs w:val="20"/>
         </w:rPr>
-        <w:t>Lotes e validade de lubrificantes devem ser registrados na O.M</w:t>
+        <w:t>O lote e a validade do lubrificante são registrados no FR 049_B (colunas “Nº lote” e “Validade”) e na O.M. É proibido usar lubrificante com a validade vencida</w:t>
       </w:r>
       <w:r>
         <w:rPr>
@@ -13414,7 +13310,7 @@
                 <w:rFonts w:cs="Arial" w:ascii="Arial" w:hAnsi="Arial"/>
                 <w:lang w:eastAsia="pt-BR"/>
               </w:rPr>
-              <w:t>Formulário de troca de óleo e filtros</w:t>
+              <w:t>Formulário de troca de óleo, filtros e fluidos (Rev.03: lote e validade do lubrificante)</w:t>
             </w:r>
           </w:p>
         </w:tc>
@@ -15810,7 +15706,7 @@
           <w:sz w:val="22"/>
           <w:szCs w:val="22"/>
         </w:rPr>
-        <w:t xml:space="preserve"> = análises de óleo e avaliações de tendência realizadas no trimestre ÷ programadas no trimestre × 100</w:t>
+        <w:t xml:space="preserve"> = testes de compressão, análises de óleo (rodízio) e avaliações de tendência realizados no trimestre ÷ programados no trimestre × 100</w:t>
       </w:r>
     </w:p>
     <w:p>
@@ -23187,17 +23083,7 @@
                 <w:szCs w:val="16"/>
                 <w:lang w:eastAsia="pt-BR"/>
               </w:rPr>
-              <w:t>‘’</w:t>
-            </w:r>
-            <w:r>
-              <w:rPr>
-                <w:rFonts w:cs="Arial" w:ascii="Arial" w:hAnsi="Arial"/>
-                <w:color w:val="000000"/>
-                <w:sz w:val="16"/>
-                <w:szCs w:val="16"/>
-                <w:lang w:eastAsia="pt-BR"/>
-              </w:rPr>
-              <w:t>Analista de Manutenção’’ para ‘’Supervisor de Manutenção’’.</w:t>
+              <w:t>‘’Analista de Manutenção’’ para ‘’Supervisor de Manutenção’’.</w:t>
             </w:r>
           </w:p>
         </w:tc>
@@ -23705,7 +23591,7 @@
                 <w:sz w:val="12"/>
                 <w:szCs w:val="12"/>
               </w:rPr>
-              <w:t>SUBSTITUIÇÃO COMPLETA DO DOCUMENTO. O antigo procedimento "Troca de Óleo Motor de Empurradores e Balsas" foi substituído pelo "Plano de Gestão de Manutenção – Empurradores"; as balsas tanque passam a ser tratadas na NP Navecunha 024. Principais mudanças: (1) Escopo ampliado para gestão completa de 8 sistemas críticos (item 6.3) e 11 sistemas no plano preventivo (item 7.1 e Anexo I); (2) 4 níveis de criticidade (Crítica/Alta/Média/Baixa) com prazos de ação (item 5.5.1); (3) KPIs com fórmulas e regras de apuração (item 9); (4) Integração com Sankhya e ClickUp; (5) Registro fotográfico (antes/depois) anexado à OM; (6) Gestão de resíduos com rastreabilidade (item 5.7); (7) Treinamento obrigatório com reciclagem anual (item 10); (8) Alinhamento com ISO 9001/14001/45001, NORMAM e NPCF-CFAOC; (9) Item 5.11 reestruturado: rotina com bloqueio e sinalização e APR padrão, atividades de risco com PT do SESMT e restritas a emergência em viagem, serviços externos; (10) Manutenção preditiva definida: análise de óleo semestral dos MCPs e tendência trimestral de parâmetros; indicador "Cumprimento do plano preditivo ≥ 80%, apuração trimestral"; (11) Programação das preventivas por horímetro e calendário; inspeções antes da saída (5.3) e em viagem (5.4); Diário de Máquinas; (12) Fórmulas de Disponibilidade, MTBF e MTTR; metas revisadas após 6 meses; (13) Estoque mínimo e Anexo III; (14) Item 5.12 e item 4.11 – responsabilidades do T.I.</w:t>
+              <w:t>O antigo procedimento "Troca de Óleo Motor de Empurradores e Balsas" foi substituído pelo "Plano de Gestão de Manutenção – Empurradores"; as balsas tanque passam a ser tratadas na NP Navecunha 024. Principais mudanças: (1) Escopo ampliado para gestão completa de 8 sistemas críticos (item 6.3) e 11 sistemas no plano preventivo (item 7.1 e Anexo I); (2) 4 níveis de criticidade (Crítica/Alta/Média/Baixa) com prazos de ação (item 5.5.1); (3) KPIs com fórmulas e regras de apuração (item 9); (4) Integração com Sankhya e ClickUp; (5) Registro fotográfico (antes/depois) anexado à OM; (6) Gestão de resíduos com rastreabilidade (item 5.7); (7) Treinamento obrigatório com reciclagem anual (item 10); (8) Alinhamento com ISO 9001/14001/45001, NORMAM e NPCF-CFAOC; (9) Item 5.11 reestruturado: rotina com bloqueio e sinalização e APR padrão, atividades de risco com PT do SESMT e restritas a emergência em viagem, serviços externos; (10) Manutenção preditiva definida: teste de compressão dos MCPs a cada 1.000 h (junto com a calibração dos bicos), análise de óleo semestral em rodízio priorizada pela compressão, com cada MCP analisado ao menos 1 vez a cada 24 meses, e tendência trimestral de parâmetros; indicador "Cumprimento do plano preditivo ≥ 80%, apuração trimestral"; (11) Programação das preventivas por horímetro e calendário; inspeções antes da saída (5.3) e em viagem (5.4); Diário de Máquinas; (12) Fórmulas de Disponibilidade, MTBF e MTTR; metas revisadas após 6 meses; (13) Estoque mínimo e Anexo III; (14) Item 5.12 e item 4.11 – responsabilidades do T.I.; (15) Horímetro do motor de popa e das motobombas registrado no FR 027_L (item 4.4); (16) Lote e validade do lubrificante registrados no FR 049_B Rev.03, proibido o uso de óleo vencido (item 5.9).</w:t>
             </w:r>
           </w:p>
         </w:tc>

</xml_diff>

<commit_message>
Motor de popa e motobomba 5 HP: troca de óleo a cada saída do comboio
Sem horímetro e com mais de 100 h por viagem: NP 7.3, Anexo I (11.1.2 e
11.3.2) e FR 049_B Rev.03 (linhas sem horímetro). Item 4.4 volta a pedir
só o horímetro de MCP e MCA.

Co-Authored-By: Claude Opus 5.5 <noreply@anthropic.com>
Claude-Session: https://claude.ai/code/session_01PZoM9S2oW9Ku6UFB6yywhw
</commit_message>
<xml_diff>
--- a/docs/NP_Navecunha_055_corrigida.docx
+++ b/docs/NP_Navecunha_055_corrigida.docx
@@ -2619,7 +2619,7 @@
           <w:rFonts w:cs="Arial" w:ascii="Arial" w:hAnsi="Arial"/>
           <w:lang w:eastAsia="pt-BR"/>
         </w:rPr>
-        <w:t xml:space="preserve"> registrar no FR 027_L, na chegada e na saída, os horímetros dos MCPs, dos MCAs, do motor de popa e das motobombas (5 HP e de incêndio).</w:t>
+        <w:t xml:space="preserve"> registrar no FR 027_L, na chegada e na saída, os horímetros dos MCPs e MCAs.</w:t>
       </w:r>
     </w:p>
     <w:p>
@@ -12488,7 +12488,7 @@
           <w:szCs w:val="20"/>
         </w:rPr>
         <w:br/>
-        <w:t>As preventivas por horas são programadas pelo Supervisor de Manutenção antes de cada saída, com base nos horímetros do FR 027_L. As preventivas por calendário são programadas mensalmente. As OMs embarcam com a hora-alvo e são executadas pelo CTF/MFM ou pela equipe de manutenção, conforme designado na OM, e encerradas na chegada ao terminal. Nas trocas de óleo, o horímetro e o prazo em meses são limites independentes: a troca vence no que ocorrer primeiro (ex.: MCP a cada 350 h ou 6 meses), conforme a Matriz técnica de equipamentos e lubrificação da frota.</w:t>
+        <w:t>As preventivas por horas são programadas pelo Supervisor de Manutenção antes de cada saída, com base nos horímetros do FR 027_L. As preventivas por calendário são programadas mensalmente. As OMs embarcam com a hora-alvo e são executadas pelo CTF/MFM ou pela equipe de manutenção, conforme designado na OM, e encerradas na chegada ao terminal. Nas trocas de óleo, o horímetro e o prazo em meses são limites independentes: a troca vence no que ocorrer primeiro (ex.: MCP a cada 350 h ou 6 meses), conforme a Matriz técnica de equipamentos e lubrificação da frota. O motor de popa e a motobomba de convés (5 HP) não têm horímetro e trabalham mais de 100 h em cada viagem: a troca de óleo desses equipamentos (Anexo I, itens 11.1.2 e 11.3.2) é feita a cada saída do comboio, registrada no FR 049_B, e o vencimento é contado pelo horímetro do MCP.</w:t>
       </w:r>
     </w:p>
     <w:p>
@@ -23591,7 +23591,7 @@
                 <w:sz w:val="12"/>
                 <w:szCs w:val="12"/>
               </w:rPr>
-              <w:t>O antigo procedimento "Troca de Óleo Motor de Empurradores e Balsas" foi substituído pelo "Plano de Gestão de Manutenção – Empurradores"; as balsas tanque passam a ser tratadas na NP Navecunha 024. Principais mudanças: (1) Escopo ampliado para gestão completa de 8 sistemas críticos (item 6.3) e 11 sistemas no plano preventivo (item 7.1 e Anexo I); (2) 4 níveis de criticidade (Crítica/Alta/Média/Baixa) com prazos de ação (item 5.5.1); (3) KPIs com fórmulas e regras de apuração (item 9); (4) Integração com Sankhya e ClickUp; (5) Registro fotográfico (antes/depois) anexado à OM; (6) Gestão de resíduos com rastreabilidade (item 5.7); (7) Treinamento obrigatório com reciclagem anual (item 10); (8) Alinhamento com ISO 9001/14001/45001, NORMAM e NPCF-CFAOC; (9) Item 5.11 reestruturado: rotina com bloqueio e sinalização e APR padrão, atividades de risco com PT do SESMT e restritas a emergência em viagem, serviços externos; (10) Manutenção preditiva definida: teste de compressão dos MCPs a cada 1.000 h (junto com a calibração dos bicos), análise de óleo semestral em rodízio priorizada pela compressão, com cada MCP analisado ao menos 1 vez a cada 24 meses, e tendência trimestral de parâmetros; indicador "Cumprimento do plano preditivo ≥ 80%, apuração trimestral"; (11) Programação das preventivas por horímetro e calendário; inspeções antes da saída (5.3) e em viagem (5.4); Diário de Máquinas; (12) Fórmulas de Disponibilidade, MTBF e MTTR; metas revisadas após 6 meses; (13) Estoque mínimo e Anexo III; (14) Item 5.12 e item 4.11 – responsabilidades do T.I.; (15) Horímetro do motor de popa e das motobombas registrado no FR 027_L (item 4.4); (16) Lote e validade do lubrificante registrados no FR 049_B Rev.03, proibido o uso de óleo vencido (item 5.9).</w:t>
+              <w:t>O antigo procedimento "Troca de Óleo Motor de Empurradores e Balsas" foi substituído pelo "Plano de Gestão de Manutenção – Empurradores"; as balsas tanque passam a ser tratadas na NP Navecunha 024. Principais mudanças: (1) Escopo ampliado para gestão completa de 8 sistemas críticos (item 6.3) e 11 sistemas no plano preventivo (item 7.1 e Anexo I); (2) 4 níveis de criticidade (Crítica/Alta/Média/Baixa) com prazos de ação (item 5.5.1); (3) KPIs com fórmulas e regras de apuração (item 9); (4) Integração com Sankhya e ClickUp; (5) Registro fotográfico (antes/depois) anexado à OM; (6) Gestão de resíduos com rastreabilidade (item 5.7); (7) Treinamento obrigatório com reciclagem anual (item 10); (8) Alinhamento com ISO 9001/14001/45001, NORMAM e NPCF-CFAOC; (9) Item 5.11 reestruturado: rotina com bloqueio e sinalização e APR padrão, atividades de risco com PT do SESMT e restritas a emergência em viagem, serviços externos; (10) Manutenção preditiva definida: teste de compressão dos MCPs a cada 1.000 h (junto com a calibração dos bicos), análise de óleo semestral em rodízio priorizada pela compressão, com cada MCP analisado ao menos 1 vez a cada 24 meses, e tendência trimestral de parâmetros; indicador "Cumprimento do plano preditivo ≥ 80%, apuração trimestral"; (11) Programação das preventivas por horímetro e calendário; inspeções antes da saída (5.3) e em viagem (5.4); Diário de Máquinas; (12) Fórmulas de Disponibilidade, MTBF e MTTR; metas revisadas após 6 meses; (13) Estoque mínimo e Anexo III; (14) Item 5.12 e item 4.11 – responsabilidades do T.I.; (15) Motor de popa e motobomba de convés sem horímetro: troca de óleo a cada saída do comboio (item 7.3); (16) Lote e validade do lubrificante registrados no FR 049_B Rev.03, proibido o uso de óleo vencido (item 5.9).</w:t>
             </w:r>
           </w:p>
         </w:tc>

</xml_diff>